<commit_message>
finished menaion stichera for UV
</commit_message>
<xml_diff>
--- a/flow/20230914_vu_template/drafts/2024-03-g/01-ПТ-Євдокії.docx
+++ b/flow/20230914_vu_template/drafts/2024-03-g/01-ПТ-Євдокії.docx
@@ -3333,33 +3333,23 @@
     </w:p>
     <w:p>
       <w:pPr>
-        <w:spacing w:after="120" w:lineRule="auto"/>
-        <w:jc w:val="both"/>
-        <w:rPr>
-          <w:rFonts w:ascii="Times New Roman" w:cs="Times New Roman" w:eastAsia="Times New Roman" w:hAnsi="Times New Roman"/>
-          <w:sz w:val="24"/>
-          <w:szCs w:val="24"/>
-        </w:rPr>
-      </w:pPr>
-      <w:r>
-        <w:rPr>
-          <w:rFonts w:ascii="Times New Roman" w:cs="Times New Roman" w:eastAsia="Times New Roman" w:hAnsi="Times New Roman"/>
-          <w:i w:val="1"/>
-          <w:color w:val="ff0000"/>
-          <w:sz w:val="24"/>
-          <w:szCs w:val="24"/>
-          <w:rtl w:val="0"/>
-        </w:rPr>
-        <w:t xml:space="preserve">(г. 8, подібний: О, преславне чудо):</w:t>
-      </w:r>
-      <w:r>
-        <w:rPr>
-          <w:rFonts w:ascii="Times New Roman" w:cs="Times New Roman" w:eastAsia="Times New Roman" w:hAnsi="Times New Roman"/>
-          <w:sz w:val="24"/>
-          <w:szCs w:val="24"/>
-          <w:rtl w:val="0"/>
-        </w:rPr>
-        <w:t xml:space="preserve"> Отче богомудрий, Герасиме,* на крилах ума* злетівши до Бога через віру,* погордував єси непостійністю світового сум’яття,* і хрест свій узявши,* за Всевидцем послідував,* тіла свавільні поривання підкорив повздержністю,* помисли – могутністю* Божественного Духа.</w:t>
+        <w:pStyle w:val="Normal"/>
+      </w:pPr>
+      <w:r>
+        <w:rPr>
+          <w:rFonts w:ascii="Times New Roman" w:hAnsi="Times New Roman"/>
+          <w:i/>
+          <w:color w:val="FF0000"/>
+          <w:sz w:val="24"/>
+        </w:rPr>
+        <w:t xml:space="preserve">(г. 4, подібний: Дав ти як знамено): </w:t>
+      </w:r>
+      <w:r>
+        <w:rPr>
+          <w:rFonts w:ascii="Times New Roman" w:hAnsi="Times New Roman"/>
+          <w:sz w:val="24"/>
+        </w:rPr>
+        <w:t>Спершу постивши* і заворушення плоті* воздержністю зів’яливши,* потім стражданням розвінчала єси підступи ворога* і перемогу здобула над ним,* о Євдокіє богоблаженна.* Тому увінчав тебе за подвійний подвиг* Ісус Чоловіколюбець* і Спаситель душ наших.</w:t>
       </w:r>
     </w:p>
     <w:p>
@@ -3437,22 +3427,14 @@
     </w:p>
     <w:p>
       <w:pPr>
-        <w:spacing w:after="120" w:lineRule="auto"/>
-        <w:jc w:val="both"/>
-        <w:rPr>
-          <w:rFonts w:ascii="Times New Roman" w:cs="Times New Roman" w:eastAsia="Times New Roman" w:hAnsi="Times New Roman"/>
-          <w:sz w:val="24"/>
-          <w:szCs w:val="24"/>
-        </w:rPr>
-      </w:pPr>
-      <w:r>
-        <w:rPr>
-          <w:rFonts w:ascii="Times New Roman" w:cs="Times New Roman" w:eastAsia="Times New Roman" w:hAnsi="Times New Roman"/>
-          <w:sz w:val="24"/>
-          <w:szCs w:val="24"/>
-          <w:rtl w:val="0"/>
-        </w:rPr>
-        <w:t xml:space="preserve">Преподобний отче Герасиме,* в пустелях повсякчасно і печерах, і горах* з вірою перебуваючи,* Бога шукав єси* – і Жаданого знайшов єси.* Маючи замість жил струни душі безоглядної,* ти добрими восходженнями завжди* і монахів лави приводив* до Христа спасатися.</w:t>
+        <w:pStyle w:val="Normal"/>
+      </w:pPr>
+      <w:r>
+        <w:rPr>
+          <w:rFonts w:ascii="Times New Roman" w:hAnsi="Times New Roman"/>
+          <w:sz w:val="24"/>
+        </w:rPr>
+        <w:t>В борозни серця* сім’я божественне, богонатхненна, прийняла єси,* наче земля родюча,* і процвіла єси воістину,* сторицею воздаючи колоссям мучеництва,* і в умозримі житниці була пожата* силою Духа, який преобразив тебе* і кращою зміною благодатно змінив,* Євдокіє всехвальна.</w:t>
       </w:r>
     </w:p>
     <w:p>
@@ -3500,22 +3482,14 @@
     </w:p>
     <w:p>
       <w:pPr>
-        <w:spacing w:after="120" w:lineRule="auto"/>
-        <w:jc w:val="both"/>
-        <w:rPr>
-          <w:rFonts w:ascii="Times New Roman" w:cs="Times New Roman" w:eastAsia="Times New Roman" w:hAnsi="Times New Roman"/>
-          <w:sz w:val="24"/>
-          <w:szCs w:val="24"/>
-        </w:rPr>
-      </w:pPr>
-      <w:r>
-        <w:rPr>
-          <w:rFonts w:ascii="Times New Roman" w:cs="Times New Roman" w:eastAsia="Times New Roman" w:hAnsi="Times New Roman"/>
-          <w:sz w:val="24"/>
-          <w:szCs w:val="24"/>
-          <w:rtl w:val="0"/>
-        </w:rPr>
-        <w:t xml:space="preserve">Все життя провівши* у безмовності великій,* і в печалі, і в сльозах,* монахів став єси наставником через віру,* убогістю прикрашений* і повздержністю приоздоблений,* чужинцем і пришельцем на землі явившись.* Тому чесно здобув єси воздаяння,* богоблаженний.</w:t>
+        <w:pStyle w:val="Normal"/>
+      </w:pPr>
+      <w:r>
+        <w:rPr>
+          <w:rFonts w:ascii="Times New Roman" w:hAnsi="Times New Roman"/>
+          <w:sz w:val="24"/>
+        </w:rPr>
+        <w:t>Мертвих воскресила ти* животворним твоїм провіщенням,* Євдокіє всехвальна,* умертвивши, всемудра,* трудами воздержности тілесні пристрасті.* І нині домуєш на Небесах з мучениками,* добре скінчивши перебіг страждання* співдіянням Духа,* за всіх, що з вірою тебе оспівують, заступаючись.</w:t>
       </w:r>
     </w:p>
     <w:p>

</xml_diff>